<commit_message>
fix: corrigir instalacao do framework para projetos novos
- .gitignore: adicionar .plan-approved aos arquivos ignorados (marker de
  runtime que nao deve ser copiado entre projetos)
- Guia: passo 2 agora lista explicitamente os 3 itens obrigatorios
  (.claude/ + CLAUDE.md + AGENTS.md)
- Guia: novo passo 3 avisa para deletar settings.local.json e
  .plan-approved se vierem na copia (residuos do projeto anterior)
- Remover guias antigos da raiz (substituidos por docs/Framework-Guide-V4-Complete.docx)
- Limpar arquivo temporario guia-old-content.txt

Co-Authored-By: Claude Opus 4.6 <noreply@anthropic.com>
</commit_message>
<xml_diff>
--- a/docs/Framework-Guide-V4-Complete.docx
+++ b/docs/Framework-Guide-V4-Complete.docx
@@ -3203,7 +3203,7 @@
                 <w:sz w:val="20"/>
                 <w:szCs w:val="20"/>
               </w:rPr>
-              <w:t xml:space="preserve">📂 Copie para o seu projeto</w:t>
+              <w:t xml:space="preserve">📂 Copie 3 itens para o seu projeto</w:t>
             </w:r>
           </w:p>
         </w:tc>
@@ -3231,7 +3231,7 @@
                 <w:sz w:val="20"/>
                 <w:szCs w:val="20"/>
               </w:rPr>
-              <w:t xml:space="preserve">Arraste a pasta .claude/ e o arquivo CLAUDE.md para a raiz do seu projeto. E so isso.</w:t>
+              <w:t xml:space="preserve">Copie para a raiz do seu projeto: (1) a pasta .claude/ inteira, (2) o arquivo CLAUDE.md e (3) o arquivo AGENTS.md. Esses 3 sao obrigatorios.</w:t>
             </w:r>
           </w:p>
         </w:tc>
@@ -3289,6 +3289,92 @@
                 <w:sz w:val="20"/>
                 <w:szCs w:val="20"/>
               </w:rPr>
+              <w:t xml:space="preserve">⚠️ Limpe arquivos residuais</w:t>
+            </w:r>
+          </w:p>
+        </w:tc>
+        <w:tc>
+          <w:tcPr>
+            <w:tcW w:type="dxa" w:w="6620"/>
+            <w:tcBorders>
+              <w:top w:val="single" w:color="D5D8DC" w:sz="1"/>
+              <w:left w:val="single" w:color="D5D8DC" w:sz="1"/>
+              <w:bottom w:val="single" w:color="D5D8DC" w:sz="1"/>
+              <w:right w:val="single" w:color="D5D8DC" w:sz="1"/>
+            </w:tcBorders>
+            <w:shd w:fill="FFFFFF" w:val="clear"/>
+            <w:tcMar>
+              <w:top w:type="dxa" w:w="60"/>
+              <w:left w:type="dxa" w:w="120"/>
+              <w:bottom w:type="dxa" w:w="60"/>
+              <w:right w:type="dxa" w:w="120"/>
+            </w:tcMar>
+          </w:tcPr>
+          <w:p>
+            <w:r>
+              <w:rPr>
+                <w:rFonts w:ascii="Calibri" w:cs="Calibri" w:eastAsia="Calibri" w:hAnsi="Calibri"/>
+                <w:sz w:val="20"/>
+                <w:szCs w:val="20"/>
+              </w:rPr>
+              <w:t xml:space="preserve">Se veio o arquivo .claude/settings.local.json, DELETE-o (contem permissoes do projeto anterior). Se veio .claude/runtime/.plan-approved, DELETE-o tambem. Esses arquivos sao gerados em tempo de execucao e nao devem ser copiados entre projetos.</w:t>
+            </w:r>
+          </w:p>
+        </w:tc>
+      </w:tr>
+      <w:tr>
+        <w:tc>
+          <w:tcPr>
+            <w:tcW w:type="dxa" w:w="700"/>
+            <w:tcBorders>
+              <w:top w:val="single" w:color="D5D8DC" w:sz="1"/>
+              <w:left w:val="single" w:color="D5D8DC" w:sz="1"/>
+              <w:bottom w:val="single" w:color="D5D8DC" w:sz="1"/>
+              <w:right w:val="single" w:color="D5D8DC" w:sz="1"/>
+            </w:tcBorders>
+            <w:shd w:fill="EBF5FB" w:val="clear"/>
+            <w:tcMar>
+              <w:top w:type="dxa" w:w="60"/>
+              <w:left w:type="dxa" w:w="120"/>
+              <w:bottom w:type="dxa" w:w="60"/>
+              <w:right w:type="dxa" w:w="120"/>
+            </w:tcMar>
+          </w:tcPr>
+          <w:p>
+            <w:r>
+              <w:rPr>
+                <w:rFonts w:ascii="Calibri" w:cs="Calibri" w:eastAsia="Calibri" w:hAnsi="Calibri"/>
+                <w:sz w:val="20"/>
+                <w:szCs w:val="20"/>
+              </w:rPr>
+              <w:t xml:space="preserve">4</w:t>
+            </w:r>
+          </w:p>
+        </w:tc>
+        <w:tc>
+          <w:tcPr>
+            <w:tcW w:type="dxa" w:w="2400"/>
+            <w:tcBorders>
+              <w:top w:val="single" w:color="D5D8DC" w:sz="1"/>
+              <w:left w:val="single" w:color="D5D8DC" w:sz="1"/>
+              <w:bottom w:val="single" w:color="D5D8DC" w:sz="1"/>
+              <w:right w:val="single" w:color="D5D8DC" w:sz="1"/>
+            </w:tcBorders>
+            <w:shd w:fill="EBF5FB" w:val="clear"/>
+            <w:tcMar>
+              <w:top w:type="dxa" w:w="60"/>
+              <w:left w:type="dxa" w:w="120"/>
+              <w:bottom w:type="dxa" w:w="60"/>
+              <w:right w:type="dxa" w:w="120"/>
+            </w:tcMar>
+          </w:tcPr>
+          <w:p>
+            <w:r>
+              <w:rPr>
+                <w:rFonts w:ascii="Calibri" w:cs="Calibri" w:eastAsia="Calibri" w:hAnsi="Calibri"/>
+                <w:sz w:val="20"/>
+                <w:szCs w:val="20"/>
+              </w:rPr>
               <w:t xml:space="preserve">🔑 De permissao aos scripts</w:t>
             </w:r>
           </w:p>
@@ -3302,7 +3388,7 @@
               <w:bottom w:val="single" w:color="D5D8DC" w:sz="1"/>
               <w:right w:val="single" w:color="D5D8DC" w:sz="1"/>
             </w:tcBorders>
-            <w:shd w:fill="FFFFFF" w:val="clear"/>
+            <w:shd w:fill="EBF5FB" w:val="clear"/>
             <w:tcMar>
               <w:top w:type="dxa" w:w="60"/>
               <w:left w:type="dxa" w:w="120"/>
@@ -3332,22 +3418,22 @@
               <w:bottom w:val="single" w:color="D5D8DC" w:sz="1"/>
               <w:right w:val="single" w:color="D5D8DC" w:sz="1"/>
             </w:tcBorders>
-            <w:shd w:fill="EBF5FB" w:val="clear"/>
-            <w:tcMar>
-              <w:top w:type="dxa" w:w="60"/>
-              <w:left w:type="dxa" w:w="120"/>
-              <w:bottom w:type="dxa" w:w="60"/>
-              <w:right w:type="dxa" w:w="120"/>
-            </w:tcMar>
-          </w:tcPr>
-          <w:p>
-            <w:r>
-              <w:rPr>
-                <w:rFonts w:ascii="Calibri" w:cs="Calibri" w:eastAsia="Calibri" w:hAnsi="Calibri"/>
-                <w:sz w:val="20"/>
-                <w:szCs w:val="20"/>
-              </w:rPr>
-              <w:t xml:space="preserve">4</w:t>
+            <w:shd w:fill="FFFFFF" w:val="clear"/>
+            <w:tcMar>
+              <w:top w:type="dxa" w:w="60"/>
+              <w:left w:type="dxa" w:w="120"/>
+              <w:bottom w:type="dxa" w:w="60"/>
+              <w:right w:type="dxa" w:w="120"/>
+            </w:tcMar>
+          </w:tcPr>
+          <w:p>
+            <w:r>
+              <w:rPr>
+                <w:rFonts w:ascii="Calibri" w:cs="Calibri" w:eastAsia="Calibri" w:hAnsi="Calibri"/>
+                <w:sz w:val="20"/>
+                <w:szCs w:val="20"/>
+              </w:rPr>
+              <w:t xml:space="preserve">5</w:t>
             </w:r>
           </w:p>
         </w:tc>
@@ -3360,7 +3446,7 @@
               <w:bottom w:val="single" w:color="D5D8DC" w:sz="1"/>
               <w:right w:val="single" w:color="D5D8DC" w:sz="1"/>
             </w:tcBorders>
-            <w:shd w:fill="EBF5FB" w:val="clear"/>
+            <w:shd w:fill="FFFFFF" w:val="clear"/>
             <w:tcMar>
               <w:top w:type="dxa" w:w="60"/>
               <w:left w:type="dxa" w:w="120"/>
@@ -3388,7 +3474,7 @@
               <w:bottom w:val="single" w:color="D5D8DC" w:sz="1"/>
               <w:right w:val="single" w:color="D5D8DC" w:sz="1"/>
             </w:tcBorders>
-            <w:shd w:fill="EBF5FB" w:val="clear"/>
+            <w:shd w:fill="FFFFFF" w:val="clear"/>
             <w:tcMar>
               <w:top w:type="dxa" w:w="60"/>
               <w:left w:type="dxa" w:w="120"/>
@@ -3418,22 +3504,22 @@
               <w:bottom w:val="single" w:color="D5D8DC" w:sz="1"/>
               <w:right w:val="single" w:color="D5D8DC" w:sz="1"/>
             </w:tcBorders>
-            <w:shd w:fill="FFFFFF" w:val="clear"/>
-            <w:tcMar>
-              <w:top w:type="dxa" w:w="60"/>
-              <w:left w:type="dxa" w:w="120"/>
-              <w:bottom w:type="dxa" w:w="60"/>
-              <w:right w:type="dxa" w:w="120"/>
-            </w:tcMar>
-          </w:tcPr>
-          <w:p>
-            <w:r>
-              <w:rPr>
-                <w:rFonts w:ascii="Calibri" w:cs="Calibri" w:eastAsia="Calibri" w:hAnsi="Calibri"/>
-                <w:sz w:val="20"/>
-                <w:szCs w:val="20"/>
-              </w:rPr>
-              <w:t xml:space="preserve">5</w:t>
+            <w:shd w:fill="EBF5FB" w:val="clear"/>
+            <w:tcMar>
+              <w:top w:type="dxa" w:w="60"/>
+              <w:left w:type="dxa" w:w="120"/>
+              <w:bottom w:type="dxa" w:w="60"/>
+              <w:right w:type="dxa" w:w="120"/>
+            </w:tcMar>
+          </w:tcPr>
+          <w:p>
+            <w:r>
+              <w:rPr>
+                <w:rFonts w:ascii="Calibri" w:cs="Calibri" w:eastAsia="Calibri" w:hAnsi="Calibri"/>
+                <w:sz w:val="20"/>
+                <w:szCs w:val="20"/>
+              </w:rPr>
+              <w:t xml:space="preserve">6</w:t>
             </w:r>
           </w:p>
         </w:tc>
@@ -3446,7 +3532,7 @@
               <w:bottom w:val="single" w:color="D5D8DC" w:sz="1"/>
               <w:right w:val="single" w:color="D5D8DC" w:sz="1"/>
             </w:tcBorders>
-            <w:shd w:fill="FFFFFF" w:val="clear"/>
+            <w:shd w:fill="EBF5FB" w:val="clear"/>
             <w:tcMar>
               <w:top w:type="dxa" w:w="60"/>
               <w:left w:type="dxa" w:w="120"/>
@@ -3474,7 +3560,7 @@
               <w:bottom w:val="single" w:color="D5D8DC" w:sz="1"/>
               <w:right w:val="single" w:color="D5D8DC" w:sz="1"/>
             </w:tcBorders>
-            <w:shd w:fill="FFFFFF" w:val="clear"/>
+            <w:shd w:fill="EBF5FB" w:val="clear"/>
             <w:tcMar>
               <w:top w:type="dxa" w:w="60"/>
               <w:left w:type="dxa" w:w="120"/>

</xml_diff>

<commit_message>
feat(plan): codex antes de apresentar, pré-check, passo 12 e padrão 22
- plan.md: codex adversarial review movido para antes de apresentar o plano
  ao usuário; pré-check obrigatório referenciado; contagem atualizada para 12 passos
- plan-construction.md: pré-check obrigatório (OIs antes_do_plan + artefatos
  da spec); passo 12 Delta pós-Codex com seção estruturada no output do plano;
  nota sobre .claude/runtime como artefatos do projeto (não código do framework)
- implementation-quality.md: categoria 8 (backend/testing) com padrão 22
  (recurso validado no startup ausente no ambiente de teste — StaticFiles,
  TestClient, factory pattern)
- CLAUDE.md: vedação explícita contra /codex:review com focus text (usar
  /codex:adversarial-review)
- docs/Framework-Guide-V4-Complete.docx: 2 tracked changes — passo 4 menciona
  que codex valida antes de apresentar; tabela codex esclarece que plano é pós-revisão

Co-Authored-By: Claude Sonnet 4.6 <noreply@anthropic.com>
</commit_message>
<xml_diff>
--- a/docs/Framework-Guide-V4-Complete.docx
+++ b/docs/Framework-Guide-V4-Complete.docx
@@ -6488,6 +6488,16 @@
               </w:rPr>
               <w:t xml:space="preserve">Desenha plano completo: objetivo, contexto, abordagem, justificativas, riscos. Se envolve migracao ou operacao irreversivel, chama agente de risco automaticamente.</w:t>
             </w:r>
+            <w:ins w:id="1001" w:author="Claude" w:date="2025-01-01T00:00:00Z">
+              <w:r>
+                <w:rPr>
+                  <w:rFonts w:ascii="Calibri" w:cs="Calibri" w:eastAsia="Calibri" w:hAnsi="Calibri"/>
+                  <w:sz w:val="20"/>
+                  <w:szCs w:val="20"/>
+                </w:rPr>
+                <w:t xml:space="preserve"> O Codex valida o plano antes de apresentar — o que voce ve ja e pos-revisao cross-model.</w:t>
+              </w:r>
+            </w:ins>
           </w:p>
         </w:tc>
       </w:tr>
@@ -12175,6 +12185,16 @@
               </w:rPr>
               <w:t xml:space="preserve">Plano vs spec, viabilidade tecnica</w:t>
             </w:r>
+            <w:ins w:id="1002" w:author="Claude" w:date="2025-01-01T00:00:00Z">
+              <w:r>
+                <w:rPr>
+                  <w:rFonts w:ascii="Calibri" w:cs="Calibri" w:eastAsia="Calibri" w:hAnsi="Calibri"/>
+                  <w:sz w:val="20"/>
+                  <w:szCs w:val="20"/>
+                </w:rPr>
+                <w:t xml:space="preserve"> (o plano apresentado ja e pos-Codex)</w:t>
+              </w:r>
+            </w:ins>
           </w:p>
         </w:tc>
       </w:tr>

</xml_diff>

<commit_message>
docs: sincronizar guia com framework — 3 ajustes finais no docx
- Sensores baseline: orientar execução do /sensors-run apenas quando
  comandos declarados já forem executáveis (não em projetos sem código)
- Passo 4 /plan: incluir pré-check obrigatório (OIs antes_do_plan +
  artefatos prometidos pela spec) e Delta pós-Codex na descrição
- Camada 4 geral: substituir "chamado AUTOMATICAMENTE após cada command"
  por linguagem precisa — checkpoints por command, /plan roda antes de
  apresentar ao usuário

Co-Authored-By: Claude Sonnet 4.6 <noreply@anthropic.com>
</commit_message>
<xml_diff>
--- a/docs/Framework-Guide-V4-Complete.docx
+++ b/docs/Framework-Guide-V4-Complete.docx
@@ -3894,14 +3894,26 @@
         </w:numPr>
         <w:spacing w:after="80"/>
       </w:pPr>
-      <w:r>
-        <w:rPr>
-          <w:rFonts w:ascii="Calibri" w:cs="Calibri" w:eastAsia="Calibri" w:hAnsi="Calibri"/>
-          <w:sz w:val="22"/>
-          <w:szCs w:val="22"/>
-        </w:rPr>
-        <w:t xml:space="preserve">Rode /sensors-run para estabelecer o baseline</w:t>
-      </w:r>
+      <w:del w:id="1003" w:author="Claude" w:date="2025-01-01T00:00:00Z">
+        <w:r>
+          <w:rPr>
+            <w:rFonts w:ascii="Calibri" w:cs="Calibri" w:eastAsia="Calibri" w:hAnsi="Calibri"/>
+            <w:sz w:val="22"/>
+            <w:szCs w:val="22"/>
+          </w:rPr>
+          <w:delText xml:space="preserve">Rode /sensors-run para estabelecer o baseline</w:delText>
+        </w:r>
+      </w:del>
+      <w:ins w:id="1004" w:author="Claude" w:date="2025-01-01T00:00:00Z">
+        <w:r>
+          <w:rPr>
+            <w:rFonts w:ascii="Calibri" w:cs="Calibri" w:eastAsia="Calibri" w:hAnsi="Calibri"/>
+            <w:sz w:val="22"/>
+            <w:szCs w:val="22"/>
+          </w:rPr>
+          <w:t xml:space="preserve">Rode /sensors-run apenas quando os comandos declarados ja forem executaveis — em projetos sem codigo ainda, execute o baseline apos o bootstrap minimo da stack</w:t>
+        </w:r>
+      </w:ins>
     </w:p>
     <w:p>
       <w:pPr>
@@ -6480,14 +6492,16 @@
             </w:tcMar>
           </w:tcPr>
           <w:p>
-            <w:r>
-              <w:rPr>
-                <w:rFonts w:ascii="Calibri" w:cs="Calibri" w:eastAsia="Calibri" w:hAnsi="Calibri"/>
-                <w:sz w:val="20"/>
-                <w:szCs w:val="20"/>
-              </w:rPr>
-              <w:t xml:space="preserve">Desenha plano completo: objetivo, contexto, abordagem, justificativas, riscos. Se envolve migracao ou operacao irreversivel, chama agente de risco automaticamente.</w:t>
-            </w:r>
+            <w:del w:id="1005" w:author="Claude" w:date="2025-01-01T00:00:00Z">
+              <w:r>
+                <w:rPr>
+                  <w:rFonts w:ascii="Calibri" w:cs="Calibri" w:eastAsia="Calibri" w:hAnsi="Calibri"/>
+                  <w:sz w:val="20"/>
+                  <w:szCs w:val="20"/>
+                </w:rPr>
+                <w:delText xml:space="preserve">Desenha plano completo: objetivo, contexto, abordagem, justificativas, riscos. Se envolve migracao ou operacao irreversivel, chama agente de risco automaticamente.</w:delText>
+              </w:r>
+            </w:del>
             <w:ins w:id="1001" w:author="Claude" w:date="2025-01-01T00:00:00Z">
               <w:r>
                 <w:rPr>
@@ -6495,7 +6509,7 @@
                   <w:sz w:val="20"/>
                   <w:szCs w:val="20"/>
                 </w:rPr>
-                <w:t xml:space="preserve"> O Codex valida o plano antes de apresentar — o que voce ve ja e pos-revisao cross-model.</w:t>
+                <w:t xml:space="preserve">Executa o pre-check obrigatorio (OIs antes_do_plan e artefatos prometidos pela spec), desenha o plano completo e, quando o Codex esta configurado, roda revisao adversarial antes de apresentar. O que voce ve ja e o plano pos-Codex, com Delta pos-Codex quando houver findings.</w:t>
               </w:r>
             </w:ins>
           </w:p>
@@ -11989,8 +12003,28 @@
           <w:sz w:val="22"/>
           <w:szCs w:val="22"/>
         </w:rPr>
-        <w:t xml:space="preserve">O Codex (GPT-5.4) e revisor adversarial. Claude implementa, Codex questiona — duas IAs de empresas diferentes. O Codex e chamado AUTOMATICAMENTE apos cada command do framework.</w:t>
+        <w:t xml:space="preserve">O Codex (GPT-5.4) e revisor adversarial. Claude implementa, Codex questiona — duas IAs de empresas diferentes. </w:t>
       </w:r>
+      <w:del w:id="1006" w:author="Claude" w:date="2025-01-01T00:00:00Z">
+        <w:r>
+          <w:rPr>
+            <w:rFonts w:ascii="Calibri" w:cs="Calibri" w:eastAsia="Calibri" w:hAnsi="Calibri"/>
+            <w:sz w:val="22"/>
+            <w:szCs w:val="22"/>
+          </w:rPr>
+          <w:delText xml:space="preserve">O Codex e chamado AUTOMATICAMENTE apos cada command do framework.</w:delText>
+        </w:r>
+      </w:del>
+      <w:ins w:id="1007" w:author="Claude" w:date="2025-01-01T00:00:00Z">
+        <w:r>
+          <w:rPr>
+            <w:rFonts w:ascii="Calibri" w:cs="Calibri" w:eastAsia="Calibri" w:hAnsi="Calibri"/>
+            <w:sz w:val="22"/>
+            <w:szCs w:val="22"/>
+          </w:rPr>
+          <w:t xml:space="preserve">O Codex e chamado nos checkpoints definidos por cada command. No /plan, roda antes de apresentar o plano ao usuario — o que voce ve ja incorpora o Delta pos-Codex.</w:t>
+        </w:r>
+      </w:ins>
     </w:p>
     <w:tbl>
       <w:tblPr>

</xml_diff>